<commit_message>
Add optional GitHub account instructions for founders
</commit_message>
<xml_diff>
--- a/docs/Literacy-Luminaries-Website-Update-Sept-2026.docx
+++ b/docs/Literacy-Luminaries-Website-Update-Sept-2026.docx
@@ -381,6 +381,157 @@
           <w:color w:val="C76B82"/>
           <w:sz w:val="32"/>
         </w:rPr>
+        <w:t>Optional: creating a free GitHub account</w:t>
+      </w:r>
+    </w:p>
+    <w:p>
+      <w:r>
+        <w:t>This part is genuinely optional, and not something you'll need day-to-day — but a</w:t>
+      </w:r>
+    </w:p>
+    <w:p>
+      <w:r>
+        <w:t>couple of you asked, so here's the short version.</w:t>
+      </w:r>
+    </w:p>
+    <w:p>
+      <w:r>
+        <w:t>Everything technical about the site (including documents like this one) lives on a</w:t>
+      </w:r>
+    </w:p>
+    <w:p>
+      <w:r>
+        <w:t xml:space="preserve">platform called </w:t>
+      </w:r>
+      <w:r>
+        <w:rPr>
+          <w:b/>
+        </w:rPr>
+        <w:t>GitHub</w:t>
+      </w:r>
+      <w:r>
+        <w:t>. Right now it's set up so anyone with the link can view it</w:t>
+      </w:r>
+    </w:p>
+    <w:p>
+      <w:r>
+        <w:t>— no account needed. At some point soon we'll lock it down to private (once there's</w:t>
+      </w:r>
+    </w:p>
+    <w:p>
+      <w:r>
+        <w:t>more sensitive info in there), and at that point you'd need a free account to keep</w:t>
+      </w:r>
+    </w:p>
+    <w:p>
+      <w:r>
+        <w:t>viewing things there.</w:t>
+      </w:r>
+    </w:p>
+    <w:p>
+      <w:r>
+        <w:t xml:space="preserve">You will </w:t>
+      </w:r>
+      <w:r>
+        <w:rPr>
+          <w:b/>
+        </w:rPr>
+        <w:t>not</w:t>
+      </w:r>
+      <w:r>
+        <w:t xml:space="preserve"> need to do anything technical with it — no code, no editing, nothing</w:t>
+      </w:r>
+    </w:p>
+    <w:p>
+      <w:r>
+        <w:t>to maintain. Worst case, it's just a login so you can occasionally view a document or</w:t>
+      </w:r>
+    </w:p>
+    <w:p>
+      <w:r>
+        <w:t>a plan. If it's ever more convenient, you can just ask me to email/text you a copy</w:t>
+      </w:r>
+    </w:p>
+    <w:p>
+      <w:r>
+        <w:t>instead of looking at GitHub directly — either way is fine.</w:t>
+      </w:r>
+    </w:p>
+    <w:p>
+      <w:r>
+        <w:t>If you'd like to set one up anyway (2 minutes, totally optional):</w:t>
+      </w:r>
+    </w:p>
+    <w:p>
+      <w:pPr>
+        <w:pStyle w:val="ListNumber"/>
+      </w:pPr>
+      <w:r>
+        <w:t xml:space="preserve">Go to </w:t>
+      </w:r>
+      <w:r>
+        <w:rPr>
+          <w:b/>
+        </w:rPr>
+        <w:t>https://github.com/signup</w:t>
+      </w:r>
+      <w:r/>
+    </w:p>
+    <w:p>
+      <w:pPr>
+        <w:pStyle w:val="ListNumber"/>
+      </w:pPr>
+      <w:r>
+        <w:t>Enter an email, create a password, and pick a username (anything you like)</w:t>
+      </w:r>
+    </w:p>
+    <w:p>
+      <w:pPr>
+        <w:pStyle w:val="ListNumber"/>
+      </w:pPr>
+      <w:r>
+        <w:t>Verify your email when it asks</w:t>
+      </w:r>
+    </w:p>
+    <w:p>
+      <w:pPr>
+        <w:pStyle w:val="ListNumber"/>
+      </w:pPr>
+      <w:r>
+        <w:t>Once logged in, plug this link into your browser to see this page again with your</w:t>
+      </w:r>
+    </w:p>
+    <w:p>
+      <w:r>
+        <w:t xml:space="preserve">account: </w:t>
+      </w:r>
+      <w:r>
+        <w:rPr>
+          <w:b/>
+        </w:rPr>
+        <w:t>https://github.com/KHWillis/literacy-luminaries</w:t>
+      </w:r>
+      <w:r/>
+    </w:p>
+    <w:p>
+      <w:r>
+        <w:t>That's it — no further setup needed. If you get stuck on any step, just send me a</w:t>
+      </w:r>
+    </w:p>
+    <w:p>
+      <w:r>
+        <w:t>screenshot and I'll help.</w:t>
+      </w:r>
+    </w:p>
+    <w:p>
+      <w:pPr>
+        <w:pStyle w:val="Heading2"/>
+      </w:pPr>
+      <w:r>
+        <w:rPr>
+          <w:color w:val="C76B82"/>
+          <w:sz w:val="32"/>
+        </w:rPr>
         <w:t>What's next on my end</w:t>
       </w:r>
     </w:p>

</xml_diff>